<commit_message>
Fichas FAI: más espaciado, Pohl simplificadas
Co-Authored-By: Claude Opus 5.5 <noreply@anthropic.com>
Claude-Session: https://claude.ai/code/session_01GdrGkTkQ1SpY6BWmf3EBwF
</commit_message>
<xml_diff>
--- a/fichas/fai-hooke.docx
+++ b/fichas/fai-hooke.docx
@@ -27,6 +27,7 @@
           <w:ilvl w:val="0"/>
           <w:numId w:val="0"/>
         </w:numPr>
+        <w:spacing w:before="440" w:after="160"/>
       </w:pPr>
       <w:r>
         <w:rPr>
@@ -38,6 +39,7 @@
     <w:p>
       <w:pPr>
         <w:pStyle w:val="FirstParagraph"/>
+        <w:spacing w:after="120" w:line="276" w:lineRule="auto"/>
         <w:jc w:val="both"/>
       </w:pPr>
       <w:r>
@@ -67,6 +69,7 @@
           <w:ilvl w:val="0"/>
           <w:numId w:val="0"/>
         </w:numPr>
+        <w:spacing w:before="440" w:after="160"/>
       </w:pPr>
       <w:r>
         <w:rPr>
@@ -78,6 +81,7 @@
     <w:p>
       <w:pPr>
         <w:pStyle w:val="FirstParagraph"/>
+        <w:spacing w:after="120" w:line="276" w:lineRule="auto"/>
         <w:jc w:val="both"/>
       </w:pPr>
       <w:r>
@@ -185,6 +189,7 @@
     <w:p>
       <w:pPr>
         <w:pStyle w:val="BodyText"/>
+        <w:spacing w:after="120" w:line="276" w:lineRule="auto"/>
         <w:jc w:val="both"/>
       </w:pPr>
       <m:oMathPara>
@@ -237,6 +242,7 @@
     <w:p>
       <w:pPr>
         <w:pStyle w:val="FirstParagraph"/>
+        <w:spacing w:after="120" w:line="276" w:lineRule="auto"/>
         <w:jc w:val="both"/>
       </w:pPr>
       <w:r>
@@ -368,6 +374,7 @@
     <w:p>
       <w:pPr>
         <w:pStyle w:val="BodyText"/>
+        <w:spacing w:after="120" w:line="276" w:lineRule="auto"/>
         <w:jc w:val="both"/>
       </w:pPr>
       <m:oMathPara>
@@ -554,6 +561,7 @@
     <w:p>
       <w:pPr>
         <w:pStyle w:val="FirstParagraph"/>
+        <w:spacing w:after="120" w:line="276" w:lineRule="auto"/>
         <w:jc w:val="both"/>
       </w:pPr>
       <w:r>
@@ -640,6 +648,7 @@
           <w:ilvl w:val="0"/>
           <w:numId w:val="0"/>
         </w:numPr>
+        <w:spacing w:before="440" w:after="160"/>
       </w:pPr>
       <w:r>
         <w:rPr>
@@ -708,6 +717,7 @@
     <w:p>
       <w:pPr>
         <w:pStyle w:val="BodyText"/>
+        <w:spacing w:after="120" w:line="276" w:lineRule="auto"/>
         <w:jc w:val="both"/>
       </w:pPr>
       <w:r>
@@ -717,6 +727,7 @@
     <w:p>
       <w:pPr>
         <w:pStyle w:val="BodyText"/>
+        <w:spacing w:after="120" w:line="276" w:lineRule="auto"/>
         <w:jc w:val="both"/>
       </w:pPr>
       <w:r>
@@ -724,7 +735,7 @@
       </w:r>
     </w:p>
     <w:bookmarkEnd w:id="26"/>
-    <w:bookmarkStart w:id="27" w:name="resultados"/>
+    <w:bookmarkStart w:id="29" w:name="resultados"/>
     <w:p>
       <w:pPr>
         <w:pStyle w:val="Heading2"/>
@@ -732,6 +743,7 @@
           <w:ilvl w:val="0"/>
           <w:numId w:val="0"/>
         </w:numPr>
+        <w:spacing w:before="440" w:after="160"/>
       </w:pPr>
       <w:r>
         <w:rPr>
@@ -743,6 +755,7 @@
     <w:p>
       <w:pPr>
         <w:pStyle w:val="FirstParagraph"/>
+        <w:spacing w:after="120" w:line="276" w:lineRule="auto"/>
         <w:jc w:val="both"/>
       </w:pPr>
       <w:r>
@@ -761,56 +774,75 @@
       </w:r>
       <w:r>
         <w:t xml:space="preserve">(portapesas + pesas), medidos con la báscula en cada paso.</w:t>
+      </w:r>
+    </w:p>
+    <w:bookmarkStart w:id="27" w:name="parte-a.-método-estático"/>
+    <w:p>
+      <w:pPr>
+        <w:pStyle w:val="Heading3"/>
+        <w:numPr>
+          <w:ilvl w:val="0"/>
+          <w:numId w:val="0"/>
+        </w:numPr>
+        <w:spacing w:before="320" w:after="120"/>
+      </w:pPr>
+      <w:r>
+        <w:rPr>
+          <w:i w:val="0"/>
+          <w:sz w:val="26"/>
+        </w:rPr>
+        <w:t xml:space="preserve">Parte A. Método estático</w:t>
       </w:r>
     </w:p>
     <w:p>
       <w:pPr>
-        <w:pStyle w:val="BodyText"/>
+        <w:pStyle w:val="FirstParagraph"/>
+        <w:spacing w:after="120" w:line="276" w:lineRule="auto"/>
         <w:jc w:val="both"/>
       </w:pPr>
       <w:r>
+        <w:t xml:space="preserve">Para cada masa, leer en la escala el alargamiento</w:t>
+      </w:r>
+      <w:r>
+        <w:t xml:space="preserve"> </w:t>
+      </w:r>
+      <m:oMath>
+        <m:r>
+          <m:t>Δ</m:t>
+        </m:r>
+        <m:r>
+          <m:t>y</m:t>
+        </m:r>
+      </m:oMath>
+      <w:r>
+        <w:t xml:space="preserve">.</w:t>
+      </w:r>
+    </w:p>
+    <w:bookmarkEnd w:id="27"/>
+    <w:bookmarkStart w:id="28" w:name="parte-b.-método-dinámico"/>
+    <w:p>
+      <w:pPr>
+        <w:pStyle w:val="Heading3"/>
+        <w:numPr>
+          <w:ilvl w:val="0"/>
+          <w:numId w:val="0"/>
+        </w:numPr>
+        <w:spacing w:before="320" w:after="120"/>
+      </w:pPr>
+      <w:r>
         <w:rPr>
-          <w:bCs/>
-          <w:b/>
+          <w:i w:val="0"/>
+          <w:sz w:val="26"/>
         </w:rPr>
-        <w:t xml:space="preserve">Parte A. Método estático.</w:t>
-      </w:r>
-      <w:r>
-        <w:t xml:space="preserve"> </w:t>
-      </w:r>
-      <w:r>
-        <w:t xml:space="preserve">Para cada masa, leer en la escala el alargamiento</w:t>
-      </w:r>
-      <w:r>
-        <w:t xml:space="preserve"> </w:t>
-      </w:r>
-      <m:oMath>
-        <m:r>
-          <m:t>Δ</m:t>
-        </m:r>
-        <m:r>
-          <m:t>y</m:t>
-        </m:r>
-      </m:oMath>
-      <w:r>
-        <w:t xml:space="preserve">.</w:t>
+        <w:t xml:space="preserve">Parte B. Método dinámico</w:t>
       </w:r>
     </w:p>
     <w:p>
       <w:pPr>
-        <w:pStyle w:val="BodyText"/>
+        <w:pStyle w:val="FirstParagraph"/>
+        <w:spacing w:after="120" w:line="276" w:lineRule="auto"/>
         <w:jc w:val="both"/>
       </w:pPr>
-      <w:r>
-        <w:rPr>
-          <w:bCs/>
-          <w:b/>
-        </w:rPr>
-        <w:t xml:space="preserve">Parte B. Método dinámico.</w:t>
-      </w:r>
-      <w:r>
-        <w:t xml:space="preserve"> </w:t>
-      </w:r>
       <w:r>
         <w:t xml:space="preserve">Para las mismas masas, separar ligeramente la masa del equilibrio, soltarla y medir tres veces el tiempo de 20 oscilaciones,</w:t>
       </w:r>
@@ -2365,14 +2397,16 @@
     <w:p>
       <w:pPr>
         <w:pStyle w:val="TableCaption"/>
+        <w:spacing w:before="80" w:after="280"/>
         <w:jc w:val="center"/>
       </w:pPr>
       <w:r>
         <w:t xml:space="preserve">Tabla 1. Alargamiento y periodo frente a la masa colgada.</w:t>
       </w:r>
     </w:p>
-    <w:bookmarkEnd w:id="27"/>
-    <w:bookmarkStart w:id="28" w:name="cuestiones"/>
+    <w:bookmarkEnd w:id="28"/>
+    <w:bookmarkEnd w:id="29"/>
+    <w:bookmarkStart w:id="30" w:name="cuestiones"/>
     <w:p>
       <w:pPr>
         <w:pStyle w:val="Heading2"/>
@@ -2380,6 +2414,7 @@
           <w:ilvl w:val="0"/>
           <w:numId w:val="0"/>
         </w:numPr>
+        <w:spacing w:before="440" w:after="160"/>
       </w:pPr>
       <w:r>
         <w:rPr>
@@ -2391,6 +2426,7 @@
     <w:p>
       <w:pPr>
         <w:pStyle w:val="FirstParagraph"/>
+        <w:spacing w:before="280" w:after="120" w:line="276" w:lineRule="auto"/>
         <w:jc w:val="both"/>
       </w:pPr>
       <w:r>
@@ -2512,6 +2548,7 @@
     <w:p>
       <w:pPr>
         <w:pStyle w:val="BodyText"/>
+        <w:spacing w:before="280" w:after="120" w:line="276" w:lineRule="auto"/>
         <w:jc w:val="both"/>
       </w:pPr>
       <w:r>
@@ -2545,6 +2582,7 @@
     <w:p>
       <w:pPr>
         <w:pStyle w:val="BodyText"/>
+        <w:spacing w:after="120" w:line="276" w:lineRule="auto"/>
         <w:jc w:val="both"/>
       </w:pPr>
       <m:oMath>
@@ -2577,6 +2615,7 @@
     <w:p>
       <w:pPr>
         <w:pStyle w:val="BodyText"/>
+        <w:spacing w:before="280" w:after="120" w:line="276" w:lineRule="auto"/>
         <w:jc w:val="both"/>
       </w:pPr>
       <w:r>
@@ -2704,6 +2743,7 @@
     <w:p>
       <w:pPr>
         <w:pStyle w:val="BodyText"/>
+        <w:spacing w:before="280" w:after="120" w:line="276" w:lineRule="auto"/>
         <w:jc w:val="both"/>
       </w:pPr>
       <w:r>
@@ -2920,6 +2960,7 @@
     <w:p>
       <w:pPr>
         <w:pStyle w:val="BodyText"/>
+        <w:spacing w:after="120" w:line="276" w:lineRule="auto"/>
         <w:jc w:val="both"/>
       </w:pPr>
       <m:oMath>
@@ -3004,7 +3045,7 @@
       </w:tr>
     </w:tbl>
     <w:p/>
-    <w:bookmarkEnd w:id="28"/>
+    <w:bookmarkEnd w:id="30"/>
     <w:sectPr>
       <w:headerReference w:type="default" r:id="rId9"/>
       <w:footerReference w:type="default" r:id="rId10"/>
@@ -3375,11 +3416,12 @@
       <w:outlineLvl w:val="2"/>
     </w:pPr>
     <w:rPr>
-      <w:rFonts w:asciiTheme="majorHAnsi" w:cstheme="majorBidi" w:eastAsiaTheme="majorEastAsia" w:hAnsiTheme="majorHAnsi"/>
+      <w:rFonts w:ascii="Arial" w:hAnsi="Arial" w:cs="Arial"/>
       <w:b/>
       <w:bCs/>
-      <w:color w:themeColor="accent1" w:val="4F81BD"/>
-      <w:sz w:val="24"/>
+      <w:i w:val="0"/>
+      <w:color w:val="000000"/>
+      <w:sz w:val="26"/>
       <w:szCs w:val="24"/>
     </w:rPr>
   </w:style>

</xml_diff>

<commit_message>
Fichas Pohl reescritas: una gráfica, figura de la oscilación, texto didáctico
Co-Authored-By: Claude Opus 5.5 <noreply@anthropic.com>
Claude-Session: https://claude.ai/code/session_01GdrGkTkQ1SpY6BWmf3EBwF
</commit_message>
<xml_diff>
--- a/fichas/fai-hooke.docx
+++ b/fichas/fai-hooke.docx
@@ -915,6 +915,17 @@
         <w:t xml:space="preserve">.</w:t>
       </w:r>
     </w:p>
+    <w:p>
+      <w:pPr>
+        <w:pStyle w:val="TableCaption"/>
+        <w:keepNext/>
+        <w:spacing w:before="200" w:after="80"/>
+        <w:jc w:val="center"/>
+      </w:pPr>
+      <w:r>
+        <w:t xml:space="preserve">Tabla 1. Alargamiento y periodo frente a la masa colgada.</w:t>
+      </w:r>
+    </w:p>
     <w:tbl>
       <w:tblPr>
         <w:tblW w:type="pct" w:w="5000"/>
@@ -2394,16 +2405,6 @@
         </w:tc>
       </w:tr>
     </w:tbl>
-    <w:p>
-      <w:pPr>
-        <w:pStyle w:val="TableCaption"/>
-        <w:spacing w:before="80" w:after="280"/>
-        <w:jc w:val="center"/>
-      </w:pPr>
-      <w:r>
-        <w:t xml:space="preserve">Tabla 1. Alargamiento y periodo frente a la masa colgada.</w:t>
-      </w:r>
-    </w:p>
     <w:bookmarkEnd w:id="28"/>
     <w:bookmarkEnd w:id="29"/>
     <w:bookmarkStart w:id="30" w:name="cuestiones"/>

</xml_diff>